<commit_message>
Hogar de Refugio: equipamiento y mobiliario listo para imprimir
Índice lleno en los Word (indice_word.py), edificaciones E-06 a E-08 como Habitaciones y cotejo de
cantidades entre metrado, especificaciones y memoria.

Co-Authored-By: Claude Opus 5.5 <noreply@anthropic.com>
Claude-Session: https://claude.ai/code/session_0142t8T16igb3VKxUPwnQPq6
</commit_message>
<xml_diff>
--- a/entregables/revision_interna/REVISION_EQUIPAMIENTO_Y_MOBILIARIO_HOGAR_REFUGIO.docx
+++ b/entregables/revision_interna/REVISION_EQUIPAMIENTO_Y_MOBILIARIO_HOGAR_REFUGIO.docx
@@ -1043,7 +1043,7 @@
                 <w:i w:val="0"/>
                 <w:sz w:val="16"/>
               </w:rPr>
-              <w:t>Dormitorios (1)</w:t>
+              <w:t>Habitaciones (1)</w:t>
             </w:r>
           </w:p>
         </w:tc>
@@ -1192,7 +1192,7 @@
                 <w:i w:val="0"/>
                 <w:sz w:val="16"/>
               </w:rPr>
-              <w:t>Dormitorios (2)</w:t>
+              <w:t>Habitaciones (2)</w:t>
             </w:r>
           </w:p>
         </w:tc>
@@ -1341,7 +1341,7 @@
                 <w:i w:val="0"/>
                 <w:sz w:val="16"/>
               </w:rPr>
-              <w:t>Dormitorios (3)</w:t>
+              <w:t>Habitaciones (3)</w:t>
             </w:r>
           </w:p>
         </w:tc>

</xml_diff>